<commit_message>
JWT defination is added
</commit_message>
<xml_diff>
--- a/JWT Authentication With Spring Boot.docx
+++ b/JWT Authentication With Spring Boot.docx
@@ -5,6 +5,24 @@
     <w:p>
       <w:pPr>
         <w:jc w:val="center"/>
+        <w:rPr>
+          <w:b/>
+          <w:bCs/>
+          <w:color w:val="FF0000"/>
+          <w:sz w:val="44"/>
+          <w:szCs w:val="44"/>
+          <w:u w:val="single"/>
+          <w:lang w:val="en-US"/>
+          <w14:textOutline w14:w="11112" w14:cap="flat" w14:cmpd="sng" w14:algn="ctr">
+            <w14:solidFill>
+              <w14:schemeClr w14:val="accent2"/>
+            </w14:solidFill>
+            <w14:prstDash w14:val="solid"/>
+            <w14:round/>
+          </w14:textOutline>
+        </w:rPr>
+      </w:pPr>
+      <w:r>
         <w:rPr>
           <w:b/>
           <w:bCs/>
@@ -21,7 +39,8 @@
             <w14:round/>
           </w14:textOutline>
         </w:rPr>
-      </w:pPr>
+        <w:t xml:space="preserve">JWT Authentication </w:t>
+      </w:r>
       <w:r>
         <w:rPr>
           <w:b/>
@@ -39,7 +58,7 @@
             <w14:round/>
           </w14:textOutline>
         </w:rPr>
-        <w:t xml:space="preserve">JWT Authentication </w:t>
+        <w:t>with</w:t>
       </w:r>
       <w:r>
         <w:rPr>
@@ -58,26 +77,51 @@
             <w14:round/>
           </w14:textOutline>
         </w:rPr>
-        <w:t>with</w:t>
-      </w:r>
-      <w:r>
-        <w:rPr>
-          <w:b/>
-          <w:bCs/>
-          <w:color w:val="F6C5AC" w:themeColor="accent2" w:themeTint="66"/>
-          <w:sz w:val="44"/>
-          <w:szCs w:val="44"/>
-          <w:u w:val="single"/>
+        <w:t xml:space="preserve"> Spring Boot</w:t>
+      </w:r>
+    </w:p>
+    <w:p>
+      <w:pPr>
+        <w:rPr>
+          <w:b/>
+          <w:bCs/>
+          <w:color w:val="196B24" w:themeColor="accent3"/>
           <w:lang w:val="en-US"/>
-          <w14:textOutline w14:w="11112" w14:cap="flat" w14:cmpd="sng" w14:algn="ctr">
-            <w14:solidFill>
-              <w14:schemeClr w14:val="accent2"/>
-            </w14:solidFill>
+          <w14:textOutline w14:w="0" w14:cap="flat" w14:cmpd="sng" w14:algn="ctr">
+            <w14:noFill/>
             <w14:prstDash w14:val="solid"/>
             <w14:round/>
           </w14:textOutline>
-        </w:rPr>
-        <w:t xml:space="preserve"> Spring Boot</w:t>
+          <w14:props3d w14:extrusionH="57150" w14:contourW="0" w14:prstMaterial="matte">
+            <w14:bevelT w14:w="63500" w14:h="12700" w14:prst="angle"/>
+            <w14:contourClr>
+              <w14:schemeClr w14:val="bg1">
+                <w14:lumMod w14:val="65000"/>
+              </w14:schemeClr>
+            </w14:contourClr>
+          </w14:props3d>
+        </w:rPr>
+      </w:pPr>
+      <w:r>
+        <w:rPr>
+          <w:b/>
+          <w:bCs/>
+          <w:color w:val="196B24" w:themeColor="accent3"/>
+          <w14:textOutline w14:w="0" w14:cap="flat" w14:cmpd="sng" w14:algn="ctr">
+            <w14:noFill/>
+            <w14:prstDash w14:val="solid"/>
+            <w14:round/>
+          </w14:textOutline>
+          <w14:props3d w14:extrusionH="57150" w14:contourW="0" w14:prstMaterial="matte">
+            <w14:bevelT w14:w="63500" w14:h="12700" w14:prst="angle"/>
+            <w14:contourClr>
+              <w14:schemeClr w14:val="bg1">
+                <w14:lumMod w14:val="65000"/>
+              </w14:schemeClr>
+            </w14:contourClr>
+          </w14:props3d>
+        </w:rPr>
+        <w:t>A JSON Web Token (JWT) is a secure way to send information between a client and a server. It is mainly used in web applications and APIs to verify users and prevent unauthorized access.</w:t>
       </w:r>
     </w:p>
     <w:p>
@@ -227,6 +271,9 @@
         <w:br/>
       </w:r>
       <w:r>
+        <w:rPr>
+          <w:noProof/>
+        </w:rPr>
         <w:drawing>
           <wp:inline distT="0" distB="0" distL="0" distR="0" wp14:anchorId="42790232" wp14:editId="5996C103">
             <wp:extent cx="5731510" cy="2341880"/>
@@ -300,6 +347,9 @@
         <w:br/>
       </w:r>
       <w:r>
+        <w:rPr>
+          <w:noProof/>
+        </w:rPr>
         <w:drawing>
           <wp:inline distT="0" distB="0" distL="0" distR="0" wp14:anchorId="20C94FB2" wp14:editId="265046B2">
             <wp:extent cx="5731510" cy="1524635"/>
@@ -371,6 +421,9 @@
         <w:br/>
       </w:r>
       <w:r>
+        <w:rPr>
+          <w:noProof/>
+        </w:rPr>
         <w:drawing>
           <wp:inline distT="0" distB="0" distL="0" distR="0" wp14:anchorId="5D1522B1" wp14:editId="7BF4DEFF">
             <wp:extent cx="5731510" cy="2301240"/>
@@ -436,6 +489,9 @@
         </w:rPr>
       </w:pPr>
       <w:r>
+        <w:rPr>
+          <w:noProof/>
+        </w:rPr>
         <w:drawing>
           <wp:inline distT="0" distB="0" distL="0" distR="0" wp14:anchorId="062A79D0" wp14:editId="2D4A6564">
             <wp:extent cx="5731510" cy="842010"/>
@@ -528,6 +584,7 @@
       </w:r>
       <w:r>
         <w:rPr>
+          <w:noProof/>
           <w:lang w:val="en-US"/>
         </w:rPr>
         <w:drawing>
@@ -669,6 +726,7 @@
       </w:r>
       <w:r>
         <w:rPr>
+          <w:noProof/>
           <w:lang w:val="en-US"/>
         </w:rPr>
         <w:drawing>
@@ -807,6 +865,7 @@
         <w:rPr>
           <w:b/>
           <w:bCs/>
+          <w:noProof/>
           <w:color w:val="47D459" w:themeColor="accent3" w:themeTint="99"/>
           <w:lang w:val="en-US"/>
         </w:rPr>
@@ -943,6 +1002,7 @@
         <w:rPr>
           <w:b/>
           <w:bCs/>
+          <w:noProof/>
           <w:color w:val="000000" w:themeColor="text1"/>
         </w:rPr>
         <w:lastRenderedPageBreak/>
@@ -1095,6 +1155,7 @@
       </w:r>
       <w:r>
         <w:rPr>
+          <w:noProof/>
           <w:color w:val="47D459" w:themeColor="accent3" w:themeTint="99"/>
         </w:rPr>
         <w:drawing>
@@ -1192,6 +1253,7 @@
         <w:rPr>
           <w:b/>
           <w:bCs/>
+          <w:noProof/>
           <w:color w:val="000000" w:themeColor="text1"/>
         </w:rPr>
         <w:drawing>
@@ -1324,6 +1386,9 @@
         </w:rPr>
       </w:pPr>
       <w:r>
+        <w:rPr>
+          <w:noProof/>
+        </w:rPr>
         <w:drawing>
           <wp:inline distT="0" distB="0" distL="0" distR="0" wp14:anchorId="36B259C5" wp14:editId="7790F765">
             <wp:extent cx="5731510" cy="1929765"/>
@@ -1414,6 +1479,7 @@
         <w:rPr>
           <w:b/>
           <w:bCs/>
+          <w:noProof/>
           <w:color w:val="000000" w:themeColor="text1"/>
         </w:rPr>
         <w:drawing>
@@ -1599,6 +1665,9 @@
         <w:br/>
       </w:r>
       <w:r>
+        <w:rPr>
+          <w:noProof/>
+        </w:rPr>
         <w:drawing>
           <wp:inline distT="0" distB="0" distL="0" distR="0" wp14:anchorId="25327C68" wp14:editId="7B88274D">
             <wp:extent cx="5731510" cy="1087120"/>
@@ -1701,6 +1770,9 @@
         <w:br/>
       </w:r>
       <w:r>
+        <w:rPr>
+          <w:noProof/>
+        </w:rPr>
         <w:drawing>
           <wp:inline distT="0" distB="0" distL="0" distR="0" wp14:anchorId="083524CF" wp14:editId="232988C3">
             <wp:extent cx="5731510" cy="2436495"/>
@@ -1810,6 +1882,9 @@
         <w:br/>
       </w:r>
       <w:r>
+        <w:rPr>
+          <w:noProof/>
+        </w:rPr>
         <w:lastRenderedPageBreak/>
         <w:drawing>
           <wp:inline distT="0" distB="0" distL="0" distR="0" wp14:anchorId="684A0798" wp14:editId="4F91E470">
@@ -1956,6 +2031,9 @@
         <w:br/>
       </w:r>
       <w:r>
+        <w:rPr>
+          <w:noProof/>
+        </w:rPr>
         <w:drawing>
           <wp:inline distT="0" distB="0" distL="0" distR="0" wp14:anchorId="3B71250C" wp14:editId="423CC5CA">
             <wp:extent cx="5731510" cy="1174115"/>
@@ -2273,6 +2351,7 @@
         <w:rPr>
           <w:b/>
           <w:bCs/>
+          <w:noProof/>
           <w:color w:val="47D459" w:themeColor="accent3" w:themeTint="99"/>
         </w:rPr>
         <w:drawing>
@@ -2461,6 +2540,7 @@
         <w:rPr>
           <w:b/>
           <w:bCs/>
+          <w:noProof/>
           <w:color w:val="47D459" w:themeColor="accent3" w:themeTint="99"/>
         </w:rPr>
         <w:drawing>
@@ -2551,6 +2631,7 @@
         <w:rPr>
           <w:b/>
           <w:bCs/>
+          <w:noProof/>
           <w:color w:val="47D459" w:themeColor="accent3" w:themeTint="99"/>
         </w:rPr>
         <w:drawing>
@@ -2682,6 +2763,7 @@
         <w:rPr>
           <w:b/>
           <w:bCs/>
+          <w:noProof/>
           <w:color w:val="47D459" w:themeColor="accent3" w:themeTint="99"/>
         </w:rPr>
         <w:drawing>
@@ -2740,6 +2822,7 @@
         <w:rPr>
           <w:b/>
           <w:bCs/>
+          <w:noProof/>
           <w:color w:val="47D459" w:themeColor="accent3" w:themeTint="99"/>
         </w:rPr>
         <w:drawing>
@@ -2895,6 +2978,7 @@
         <w:rPr>
           <w:b/>
           <w:bCs/>
+          <w:noProof/>
           <w:color w:val="000000" w:themeColor="text1"/>
         </w:rPr>
         <w:drawing>
@@ -2985,6 +3069,7 @@
         <w:rPr>
           <w:b/>
           <w:bCs/>
+          <w:noProof/>
           <w:color w:val="000000" w:themeColor="text1"/>
         </w:rPr>
         <w:drawing>
@@ -3069,6 +3154,7 @@
         <w:rPr>
           <w:b/>
           <w:bCs/>
+          <w:noProof/>
           <w:color w:val="47D459" w:themeColor="accent3" w:themeTint="99"/>
         </w:rPr>
         <w:drawing>
@@ -3138,15 +3224,7 @@
           <w:color w:val="47D459" w:themeColor="accent3" w:themeTint="99"/>
         </w:rPr>
         <w:lastRenderedPageBreak/>
-        <w:t>Now Restart the application</w:t>
-      </w:r>
-      <w:r>
-        <w:rPr>
-          <w:b/>
-          <w:bCs/>
-          <w:color w:val="47D459" w:themeColor="accent3" w:themeTint="99"/>
-        </w:rPr>
-        <w:t xml:space="preserve"> And Enter Username and Password.</w:t>
+        <w:t>Now Restart the application And Enter Username and Password.</w:t>
       </w:r>
       <w:r>
         <w:rPr>
@@ -3160,6 +3238,7 @@
         <w:rPr>
           <w:b/>
           <w:bCs/>
+          <w:noProof/>
           <w:color w:val="47D459" w:themeColor="accent3" w:themeTint="99"/>
         </w:rPr>
         <w:drawing>
@@ -3243,6 +3322,7 @@
         <w:rPr>
           <w:b/>
           <w:bCs/>
+          <w:noProof/>
           <w:color w:val="47D459" w:themeColor="accent3" w:themeTint="99"/>
         </w:rPr>
         <w:drawing>
@@ -3315,6 +3395,7 @@
         <w:rPr>
           <w:b/>
           <w:bCs/>
+          <w:noProof/>
           <w:color w:val="47D459" w:themeColor="accent3" w:themeTint="99"/>
         </w:rPr>
         <w:drawing>
@@ -3397,6 +3478,7 @@
         <w:rPr>
           <w:b/>
           <w:bCs/>
+          <w:noProof/>
           <w:color w:val="47D459" w:themeColor="accent3" w:themeTint="99"/>
         </w:rPr>
         <w:lastRenderedPageBreak/>
@@ -3448,6 +3530,7 @@
         <w:rPr>
           <w:b/>
           <w:bCs/>
+          <w:noProof/>
           <w:color w:val="47D459" w:themeColor="accent3" w:themeTint="99"/>
         </w:rPr>
         <w:drawing>
@@ -3530,6 +3613,7 @@
         <w:rPr>
           <w:b/>
           <w:bCs/>
+          <w:noProof/>
           <w:color w:val="47D459" w:themeColor="accent3" w:themeTint="99"/>
         </w:rPr>
         <w:drawing>
@@ -3615,6 +3699,7 @@
         <w:rPr>
           <w:b/>
           <w:bCs/>
+          <w:noProof/>
           <w:color w:val="47D459" w:themeColor="accent3" w:themeTint="99"/>
         </w:rPr>
         <w:drawing>
@@ -3699,6 +3784,7 @@
         <w:rPr>
           <w:b/>
           <w:bCs/>
+          <w:noProof/>
           <w:color w:val="47D459" w:themeColor="accent3" w:themeTint="99"/>
         </w:rPr>
         <w:drawing>
@@ -3854,7 +3940,7 @@
           <w:bCs/>
           <w:color w:val="0D0D0D" w:themeColor="text1" w:themeTint="F2"/>
         </w:rPr>
-        <w:t xml:space="preserve">E.g. </w:t>
+        <w:t>E.g. If you go to a store and there is a huge crowd, if they are selling half the items outside, and if we want to buy something, we need to get a token</w:t>
       </w:r>
       <w:r>
         <w:rPr>
@@ -3862,7 +3948,7 @@
           <w:bCs/>
           <w:color w:val="0D0D0D" w:themeColor="text1" w:themeTint="F2"/>
         </w:rPr>
-        <w:t>If you go to a store and there is a huge crowd, if they are selling half the items outside, and if we want to buy something, we need to get a token</w:t>
+        <w:t xml:space="preserve"> by counter</w:t>
       </w:r>
       <w:r>
         <w:rPr>
@@ -3870,47 +3956,7 @@
           <w:bCs/>
           <w:color w:val="0D0D0D" w:themeColor="text1" w:themeTint="F2"/>
         </w:rPr>
-        <w:t xml:space="preserve"> by counter</w:t>
-      </w:r>
-      <w:r>
-        <w:rPr>
-          <w:b/>
-          <w:bCs/>
-          <w:color w:val="0D0D0D" w:themeColor="text1" w:themeTint="F2"/>
-        </w:rPr>
-        <w:t xml:space="preserve"> for any food items. Then we take the token and give it to </w:t>
-      </w:r>
-      <w:r>
-        <w:rPr>
-          <w:b/>
-          <w:bCs/>
-          <w:color w:val="0D0D0D" w:themeColor="text1" w:themeTint="F2"/>
-        </w:rPr>
-        <w:t>them and</w:t>
-      </w:r>
-      <w:r>
-        <w:rPr>
-          <w:b/>
-          <w:bCs/>
-          <w:color w:val="0D0D0D" w:themeColor="text1" w:themeTint="F2"/>
-        </w:rPr>
-        <w:t xml:space="preserve"> based on that token they give us the items. It is the same here; we need to take the token </w:t>
-      </w:r>
-      <w:r>
-        <w:rPr>
-          <w:b/>
-          <w:bCs/>
-          <w:color w:val="0D0D0D" w:themeColor="text1" w:themeTint="F2"/>
-        </w:rPr>
-        <w:t>first and</w:t>
-      </w:r>
-      <w:r>
-        <w:rPr>
-          <w:b/>
-          <w:bCs/>
-          <w:color w:val="0D0D0D" w:themeColor="text1" w:themeTint="F2"/>
-        </w:rPr>
-        <w:t xml:space="preserve"> using that token we can access the API.</w:t>
+        <w:t xml:space="preserve"> for any food items. Then we take the token and give it to them and based on that token they give us the items. It is the same here; we need to take the token first and using that token we can access the API.</w:t>
       </w:r>
       <w:r>
         <w:rPr>
@@ -4044,6 +4090,7 @@
         <w:rPr>
           <w:b/>
           <w:bCs/>
+          <w:noProof/>
           <w:color w:val="47D459" w:themeColor="accent3" w:themeTint="99"/>
         </w:rPr>
         <w:drawing>
@@ -4144,6 +4191,7 @@
         <w:rPr>
           <w:b/>
           <w:bCs/>
+          <w:noProof/>
           <w:color w:val="47D459" w:themeColor="accent3" w:themeTint="99"/>
         </w:rPr>
         <w:drawing>
@@ -4252,6 +4300,7 @@
         <w:rPr>
           <w:b/>
           <w:bCs/>
+          <w:noProof/>
           <w:color w:val="47D459" w:themeColor="accent3" w:themeTint="99"/>
         </w:rPr>
         <w:drawing>
@@ -4418,6 +4467,7 @@
         <w:rPr>
           <w:b/>
           <w:bCs/>
+          <w:noProof/>
           <w:color w:val="47D459" w:themeColor="accent3" w:themeTint="99"/>
         </w:rPr>
         <w:drawing>
@@ -4813,6 +4863,7 @@
         <w:rPr>
           <w:b/>
           <w:bCs/>
+          <w:noProof/>
           <w:color w:val="000000" w:themeColor="text1"/>
         </w:rPr>
         <w:drawing>
@@ -4927,6 +4978,7 @@
       </w:r>
       <w:r>
         <w:rPr>
+          <w:noProof/>
           <w:color w:val="000000" w:themeColor="text1"/>
         </w:rPr>
         <w:drawing>
@@ -5075,29 +5127,7 @@
           <w:szCs w:val="36"/>
           <w:highlight w:val="yellow"/>
         </w:rPr>
-        <w:t xml:space="preserve">How to implement </w:t>
-      </w:r>
-      <w:r>
-        <w:rPr>
-          <w:b/>
-          <w:bCs/>
-          <w:color w:val="45B0E1" w:themeColor="accent1" w:themeTint="99"/>
-          <w:sz w:val="36"/>
-          <w:szCs w:val="36"/>
-          <w:highlight w:val="yellow"/>
-        </w:rPr>
-        <w:t xml:space="preserve">JWT </w:t>
-      </w:r>
-      <w:r>
-        <w:rPr>
-          <w:b/>
-          <w:bCs/>
-          <w:color w:val="45B0E1" w:themeColor="accent1" w:themeTint="99"/>
-          <w:sz w:val="36"/>
-          <w:szCs w:val="36"/>
-          <w:highlight w:val="yellow"/>
-        </w:rPr>
-        <w:t>Token</w:t>
+        <w:t>How to implement JWT Token</w:t>
       </w:r>
     </w:p>
     <w:p>
@@ -5119,15 +5149,7 @@
           <w:bCs/>
           <w:color w:val="002060"/>
         </w:rPr>
-        <w:t>Make sure spring-boot-starter-security is there in pom.xm</w:t>
-      </w:r>
-      <w:r>
-        <w:rPr>
-          <w:b/>
-          <w:bCs/>
-          <w:color w:val="002060"/>
-        </w:rPr>
-        <w:t>l</w:t>
+        <w:t>Make sure spring-boot-starter-security is there in pom.xml</w:t>
       </w:r>
     </w:p>
     <w:p>
@@ -5200,6 +5222,7 @@
         <w:rPr>
           <w:b/>
           <w:bCs/>
+          <w:noProof/>
           <w:color w:val="000000" w:themeColor="text1"/>
         </w:rPr>
         <w:drawing>
@@ -5260,6 +5283,7 @@
         <w:rPr>
           <w:b/>
           <w:bCs/>
+          <w:noProof/>
           <w:color w:val="000000" w:themeColor="text1"/>
         </w:rPr>
         <w:drawing>
@@ -5543,6 +5567,9 @@
         <w:br/>
       </w:r>
       <w:r>
+        <w:rPr>
+          <w:noProof/>
+        </w:rPr>
         <w:drawing>
           <wp:inline distT="0" distB="0" distL="0" distR="0" wp14:anchorId="2ADE6626" wp14:editId="3462E96D">
             <wp:extent cx="5731510" cy="2440305"/>
@@ -5588,6 +5615,9 @@
         <w:br/>
       </w:r>
       <w:r>
+        <w:rPr>
+          <w:noProof/>
+        </w:rPr>
         <w:drawing>
           <wp:inline distT="0" distB="0" distL="0" distR="0" wp14:anchorId="1EBB2957" wp14:editId="6A576F3E">
             <wp:extent cx="5731510" cy="2506980"/>
@@ -5704,47 +5734,7 @@
           <w:bCs/>
           <w:color w:val="002060"/>
         </w:rPr>
-        <w:t xml:space="preserve"> and override method and write the logic to check the token that is </w:t>
-      </w:r>
-      <w:r>
-        <w:rPr>
-          <w:b/>
-          <w:bCs/>
-          <w:color w:val="002060"/>
-        </w:rPr>
-        <w:t>coming</w:t>
-      </w:r>
-      <w:r>
-        <w:rPr>
-          <w:b/>
-          <w:bCs/>
-          <w:color w:val="002060"/>
-        </w:rPr>
-        <w:t xml:space="preserve"> in header. We </w:t>
-      </w:r>
-      <w:r>
-        <w:rPr>
-          <w:b/>
-          <w:bCs/>
-          <w:color w:val="002060"/>
-        </w:rPr>
-        <w:t>must</w:t>
-      </w:r>
-      <w:r>
-        <w:rPr>
-          <w:b/>
-          <w:bCs/>
-          <w:color w:val="002060"/>
-        </w:rPr>
-        <w:t xml:space="preserve"> write 5 important </w:t>
-      </w:r>
-      <w:r>
-        <w:rPr>
-          <w:b/>
-          <w:bCs/>
-          <w:color w:val="002060"/>
-        </w:rPr>
-        <w:t>logics</w:t>
+        <w:t> and override method and write the logic to check the token that is coming in header. We must write 5 important logics</w:t>
       </w:r>
     </w:p>
     <w:p>
@@ -5885,6 +5875,9 @@
         </w:rPr>
       </w:pPr>
       <w:r>
+        <w:rPr>
+          <w:noProof/>
+        </w:rPr>
         <w:lastRenderedPageBreak/>
         <w:drawing>
           <wp:inline distT="0" distB="0" distL="0" distR="0" wp14:anchorId="63409925" wp14:editId="7AA0E187">
@@ -5931,6 +5924,9 @@
         <w:br/>
       </w:r>
       <w:r>
+        <w:rPr>
+          <w:noProof/>
+        </w:rPr>
         <w:drawing>
           <wp:inline distT="0" distB="0" distL="0" distR="0" wp14:anchorId="244B7ABE" wp14:editId="5158B06A">
             <wp:extent cx="5731510" cy="2424430"/>
@@ -6019,6 +6015,7 @@
         <w:rPr>
           <w:b/>
           <w:bCs/>
+          <w:noProof/>
           <w:color w:val="000000" w:themeColor="text1"/>
         </w:rPr>
         <w:drawing>
@@ -6149,6 +6146,7 @@
         <w:rPr>
           <w:b/>
           <w:bCs/>
+          <w:noProof/>
           <w:color w:val="000000" w:themeColor="text1"/>
         </w:rPr>
         <w:drawing>
@@ -6200,6 +6198,7 @@
         <w:rPr>
           <w:b/>
           <w:bCs/>
+          <w:noProof/>
           <w:color w:val="000000" w:themeColor="text1"/>
         </w:rPr>
         <w:drawing>
@@ -6251,6 +6250,7 @@
         <w:rPr>
           <w:b/>
           <w:bCs/>
+          <w:noProof/>
           <w:color w:val="000000" w:themeColor="text1"/>
         </w:rPr>
         <w:drawing>
@@ -6328,23 +6328,7 @@
           <w:color w:val="002060"/>
         </w:rPr>
         <w:lastRenderedPageBreak/>
-        <w:t xml:space="preserve">Create login </w:t>
-      </w:r>
-      <w:r>
-        <w:rPr>
-          <w:b/>
-          <w:bCs/>
-          <w:color w:val="002060"/>
-        </w:rPr>
-        <w:t>API</w:t>
-      </w:r>
-      <w:r>
-        <w:rPr>
-          <w:b/>
-          <w:bCs/>
-          <w:color w:val="002060"/>
-        </w:rPr>
-        <w:t xml:space="preserve"> to accept username and password and return token if username and password is correct.</w:t>
+        <w:t>Create login API to accept username and password and return token if username and password is correct.</w:t>
       </w:r>
       <w:r>
         <w:rPr>
@@ -6358,6 +6342,7 @@
         <w:rPr>
           <w:b/>
           <w:bCs/>
+          <w:noProof/>
           <w:color w:val="000000" w:themeColor="text1"/>
         </w:rPr>
         <w:drawing>
@@ -6408,6 +6393,7 @@
         <w:rPr>
           <w:b/>
           <w:bCs/>
+          <w:noProof/>
           <w:color w:val="000000" w:themeColor="text1"/>
         </w:rPr>
         <w:drawing>
@@ -6539,15 +6525,7 @@
           <w:color w:val="002060"/>
         </w:rPr>
         <w:lastRenderedPageBreak/>
-        <w:t>Test Application</w:t>
-      </w:r>
-      <w:r>
-        <w:rPr>
-          <w:b/>
-          <w:bCs/>
-          <w:color w:val="002060"/>
-        </w:rPr>
-        <w:t xml:space="preserve"> </w:t>
+        <w:t xml:space="preserve">Test Application </w:t>
       </w:r>
       <w:r>
         <w:rPr>
@@ -6571,6 +6549,7 @@
         <w:rPr>
           <w:b/>
           <w:bCs/>
+          <w:noProof/>
           <w:color w:val="000000" w:themeColor="text1"/>
         </w:rPr>
         <w:drawing>
@@ -6669,6 +6648,7 @@
       </w:r>
       <w:r>
         <w:rPr>
+          <w:noProof/>
           <w:color w:val="000000" w:themeColor="text1"/>
         </w:rPr>
         <w:drawing>
@@ -6783,6 +6763,7 @@
         <w:rPr>
           <w:b/>
           <w:bCs/>
+          <w:noProof/>
           <w:color w:val="000000" w:themeColor="text1"/>
         </w:rPr>
         <w:drawing>
@@ -7086,6 +7067,7 @@
         <w:rPr>
           <w:b/>
           <w:bCs/>
+          <w:noProof/>
           <w:color w:val="000000" w:themeColor="text1"/>
         </w:rPr>
         <w:drawing>

</xml_diff>